<commit_message>
feat: implement save order feature and fix UI alignment issues
</commit_message>
<xml_diff>
--- a/TheBoxSync_Project_Details.docx
+++ b/TheBoxSync_Project_Details.docx
@@ -60,13 +60,28 @@
           <w:b/>
           <w:color w:val="2E7559"/>
         </w:rPr>
-        <w:t>₹8,000 / month</w:t>
+        <w:t xml:space="preserve">₹8,000 / </w:t>
+      </w:r>
+      <w:proofErr w:type="gramStart"/>
+      <w:r>
+        <w:rPr>
+          <w:b/>
+          <w:color w:val="2E7559"/>
+        </w:rPr>
+        <w:t>month</w:t>
       </w:r>
       <w:r>
         <w:rPr>
           <w:color w:val="B4B4B4"/>
         </w:rPr>
-        <w:t xml:space="preserve">  |  </w:t>
+        <w:t xml:space="preserve">  |</w:t>
+      </w:r>
+      <w:proofErr w:type="gramEnd"/>
+      <w:r>
+        <w:rPr>
+          <w:color w:val="B4B4B4"/>
+        </w:rPr>
+        <w:t xml:space="preserve">  </w:t>
       </w:r>
       <w:r>
         <w:rPr>
@@ -85,12 +100,14 @@
       <w:pPr>
         <w:pStyle w:val="Heading2"/>
       </w:pPr>
+      <w:bookmarkStart w:id="0" w:name="_Hlk234422886"/>
       <w:r>
         <w:rPr>
           <w:color w:val="1B365D"/>
         </w:rPr>
         <w:t>Included Features &amp; Functional Points Explained:</w:t>
       </w:r>
+      <w:bookmarkEnd w:id="0"/>
     </w:p>
     <w:p>
       <w:pPr>
@@ -1146,13 +1163,28 @@
           <w:b/>
           <w:color w:val="2E7559"/>
         </w:rPr>
-        <w:t>₹10,000 / month</w:t>
+        <w:t xml:space="preserve">₹10,000 / </w:t>
+      </w:r>
+      <w:proofErr w:type="gramStart"/>
+      <w:r>
+        <w:rPr>
+          <w:b/>
+          <w:color w:val="2E7559"/>
+        </w:rPr>
+        <w:t>month</w:t>
       </w:r>
       <w:r>
         <w:rPr>
           <w:color w:val="B4B4B4"/>
         </w:rPr>
-        <w:t xml:space="preserve">  |  </w:t>
+        <w:t xml:space="preserve">  |</w:t>
+      </w:r>
+      <w:proofErr w:type="gramEnd"/>
+      <w:r>
+        <w:rPr>
+          <w:color w:val="B4B4B4"/>
+        </w:rPr>
+        <w:t xml:space="preserve">  </w:t>
       </w:r>
       <w:r>
         <w:rPr>
@@ -2214,629 +2246,630 @@
           <w:sz w:val="36"/>
         </w:rPr>
         <w:lastRenderedPageBreak/>
-        <w:t>Plan 3: FINE</w:t>
-      </w:r>
+        <w:t>Plan 3: FINE            DINE Plan</w:t>
+      </w:r>
+    </w:p>
+    <w:p>
+      <w:pPr>
+        <w:spacing w:after="240"/>
+      </w:pPr>
+      <w:r>
+        <w:rPr>
+          <w:b/>
+        </w:rPr>
+        <w:t xml:space="preserve">Plan Price (Promo): </w:t>
+      </w:r>
+      <w:r>
+        <w:rPr>
+          <w:b/>
+          <w:color w:val="2E7559"/>
+        </w:rPr>
+        <w:t xml:space="preserve">₹16,000 / </w:t>
+      </w:r>
+      <w:proofErr w:type="gramStart"/>
+      <w:r>
+        <w:rPr>
+          <w:b/>
+          <w:color w:val="2E7559"/>
+        </w:rPr>
+        <w:t>month</w:t>
+      </w:r>
+      <w:r>
+        <w:rPr>
+          <w:color w:val="B4B4B4"/>
+        </w:rPr>
+        <w:t xml:space="preserve">  |</w:t>
+      </w:r>
+      <w:proofErr w:type="gramEnd"/>
+      <w:r>
+        <w:rPr>
+          <w:color w:val="B4B4B4"/>
+        </w:rPr>
+        <w:t xml:space="preserve">  </w:t>
+      </w:r>
+      <w:r>
+        <w:rPr>
+          <w:b/>
+        </w:rPr>
+        <w:t xml:space="preserve">Actual Price: </w:t>
+      </w:r>
+      <w:r>
+        <w:rPr>
+          <w:i/>
+        </w:rPr>
+        <w:t>₹20,000 / month (Strikethrough in catalog)</w:t>
+      </w:r>
+    </w:p>
+    <w:p>
+      <w:pPr>
+        <w:pStyle w:val="Heading2"/>
+      </w:pPr>
+      <w:r>
+        <w:rPr>
+          <w:color w:val="1B365D"/>
+        </w:rPr>
+        <w:t>Included Features &amp; Functional Points Explained:</w:t>
+      </w:r>
+    </w:p>
+    <w:p>
+      <w:pPr>
+        <w:pStyle w:val="ListBullet"/>
+        <w:spacing w:after="60"/>
+      </w:pPr>
+      <w:r>
+        <w:rPr>
+          <w:b/>
+          <w:color w:val="1B365D"/>
+        </w:rPr>
+        <w:t xml:space="preserve">Inventory Management (BILLING &amp; CORE): </w:t>
+      </w:r>
+      <w:r>
+        <w:t>Tracks raw material stock, recipe ingredients, purchase orders, and supplier bills in real-time, helping reduce food waste and optimize costs.</w:t>
+      </w:r>
+    </w:p>
+    <w:p>
+      <w:pPr>
+        <w:pStyle w:val="ListBullet"/>
+        <w:spacing w:after="60"/>
+      </w:pPr>
+      <w:r>
+        <w:rPr>
+          <w:b/>
+          <w:color w:val="1B365D"/>
+        </w:rPr>
+        <w:t xml:space="preserve">Statistics Management (BILLING &amp; CORE): </w:t>
+      </w:r>
+      <w:r>
+        <w:t>Provides analytical dashboards showing top-performing dishes, sales volumes, hourly peaks, and revenue margins to support data-driven decisions.</w:t>
+      </w:r>
+    </w:p>
+    <w:p>
+      <w:pPr>
+        <w:pStyle w:val="ListBullet"/>
+        <w:spacing w:after="60"/>
+      </w:pPr>
+      <w:r>
+        <w:rPr>
+          <w:b/>
+          <w:color w:val="1B365D"/>
+        </w:rPr>
+        <w:t xml:space="preserve">Third-party Integrations (BILLING &amp; CORE): </w:t>
+      </w:r>
+      <w:r>
+        <w:t>Seamlessly syncs orders from food delivery platforms (such as Swiggy and Zomato) directly into the POS system, avoiding manual double-entry.</w:t>
+      </w:r>
+    </w:p>
+    <w:p>
+      <w:pPr>
+        <w:pStyle w:val="ListBullet"/>
+        <w:spacing w:after="60"/>
+      </w:pPr>
+      <w:r>
+        <w:rPr>
+          <w:b/>
+          <w:color w:val="1B365D"/>
+        </w:rPr>
+        <w:t xml:space="preserve">In-built CRM (BILLING &amp; CORE): </w:t>
+      </w:r>
+      <w:r>
+        <w:t>Saves guest order history, contact details, and dietary preferences to deliver a personalized dining experience.</w:t>
+      </w:r>
+    </w:p>
+    <w:p>
+      <w:pPr>
+        <w:pStyle w:val="ListBullet"/>
+        <w:spacing w:after="60"/>
+      </w:pPr>
+      <w:r>
+        <w:rPr>
+          <w:b/>
+          <w:color w:val="1B365D"/>
+        </w:rPr>
+        <w:t xml:space="preserve">Menu Management (BILLING &amp; CORE): </w:t>
+      </w:r>
+      <w:r>
+        <w:t>Allows instant updates to categories, pricing, item availability, and modifiers across all POS registers and online menus.</w:t>
+      </w:r>
+    </w:p>
+    <w:p>
+      <w:pPr>
+        <w:pStyle w:val="ListBullet"/>
+        <w:spacing w:after="60"/>
+      </w:pPr>
+      <w:r>
+        <w:rPr>
+          <w:b/>
+          <w:color w:val="1B365D"/>
+        </w:rPr>
+        <w:t xml:space="preserve">Staff Management (BILLING &amp; CORE): </w:t>
+      </w:r>
+      <w:r>
+        <w:t>Tracks employee attendance, shift schedules, check-in/out stamps, and sets granular user roles and system access permissions.</w:t>
+      </w:r>
+    </w:p>
+    <w:p>
+      <w:pPr>
+        <w:pStyle w:val="ListBullet"/>
+        <w:spacing w:after="60"/>
+      </w:pPr>
+      <w:r>
+        <w:rPr>
+          <w:b/>
+          <w:color w:val="1B365D"/>
+        </w:rPr>
+        <w:t xml:space="preserve">Unlimited Users &amp; Terminals (BILLING &amp; CORE): </w:t>
+      </w:r>
+      <w:r>
+        <w:t>Enables the software to run on multiple devices (mobiles, tablets, PCs) without charging extra licensing fees per device/user.</w:t>
+      </w:r>
+    </w:p>
+    <w:p>
+      <w:pPr>
+        <w:pStyle w:val="ListBullet"/>
+        <w:spacing w:after="60"/>
+      </w:pPr>
+      <w:r>
+        <w:rPr>
+          <w:b/>
+          <w:color w:val="1B365D"/>
+        </w:rPr>
+        <w:t xml:space="preserve">Unlimited Cash Register (BILLING &amp; CORE): </w:t>
+      </w:r>
+      <w:r>
+        <w:t>Allows the creation of multiple digital tills to manage separate cashier drawers, making shift handovers and reconciliations easy.</w:t>
+      </w:r>
+    </w:p>
+    <w:p>
+      <w:pPr>
+        <w:pStyle w:val="ListBullet"/>
+        <w:spacing w:after="60"/>
+      </w:pPr>
+      <w:r>
+        <w:rPr>
+          <w:b/>
+          <w:color w:val="1B365D"/>
+        </w:rPr>
+        <w:t xml:space="preserve">Multi-terminal Billing (BILLING &amp; CORE): </w:t>
+      </w:r>
+      <w:r>
+        <w:t>Supports simultaneous order entering and payment processing on different registers, minimizing queue times during rush hours.</w:t>
+      </w:r>
+    </w:p>
+    <w:p>
+      <w:pPr>
+        <w:pStyle w:val="ListBullet"/>
+        <w:spacing w:after="60"/>
+      </w:pPr>
+      <w:r>
+        <w:rPr>
+          <w:b/>
+          <w:color w:val="1B365D"/>
+        </w:rPr>
+        <w:t xml:space="preserve">Manager Panel (ADD-ONS): </w:t>
+      </w:r>
+      <w:r>
+        <w:t>A back-office control panel that managers use to view real-time sales, adjust system settings, manage configurations, and edit staff rosters.</w:t>
+      </w:r>
+    </w:p>
+    <w:p>
+      <w:pPr>
+        <w:pStyle w:val="ListBullet"/>
+        <w:spacing w:after="60"/>
+      </w:pPr>
+      <w:r>
+        <w:rPr>
+          <w:b/>
+          <w:color w:val="1B365D"/>
+        </w:rPr>
+        <w:t xml:space="preserve">Create Cashier (ADD-ONS): </w:t>
+      </w:r>
+      <w:r>
+        <w:t>Gives the ability to onboard cashiers, trace active till sessions, and audit open/closed register balances.</w:t>
+      </w:r>
+    </w:p>
+    <w:p>
+      <w:pPr>
+        <w:pStyle w:val="ListBullet"/>
+        <w:spacing w:after="60"/>
+      </w:pPr>
+      <w:r>
+        <w:rPr>
+          <w:b/>
+          <w:color w:val="1B365D"/>
+        </w:rPr>
+        <w:t xml:space="preserve">Captain Panel (ADD-ONS): </w:t>
+      </w:r>
+      <w:r>
+        <w:t>A tableside ordering interface designed for waiters to enter customer selections, customize order notes, and send KOTs instantly to the kitchen.</w:t>
+      </w:r>
+    </w:p>
+    <w:p>
+      <w:pPr>
+        <w:pStyle w:val="ListBullet"/>
+        <w:spacing w:after="60"/>
+      </w:pPr>
+      <w:r>
+        <w:rPr>
+          <w:b/>
+          <w:color w:val="1B365D"/>
+        </w:rPr>
+        <w:t xml:space="preserve">Kitchen Display System (ADD-ONS): </w:t>
+      </w:r>
+      <w:r>
+        <w:t>A digital screen in the kitchen that organizes active orders chronologically, replacing paper slips and tracking preparation times.</w:t>
+      </w:r>
+    </w:p>
+    <w:p>
+      <w:pPr>
+        <w:pStyle w:val="ListBullet"/>
+        <w:spacing w:after="60"/>
+      </w:pPr>
+      <w:r>
+        <w:rPr>
+          <w:b/>
+          <w:color w:val="1B365D"/>
+        </w:rPr>
+        <w:t xml:space="preserve">Reservation Management (ADD-ONS): </w:t>
+      </w:r>
+      <w:r>
+        <w:t>An advanced tool to book guest tables, schedule dining slots, and manage waiting lists during busy periods.</w:t>
+      </w:r>
+    </w:p>
+    <w:p>
+      <w:pPr>
+        <w:pStyle w:val="ListBullet"/>
+        <w:spacing w:after="60"/>
+      </w:pPr>
+      <w:r>
+        <w:rPr>
+          <w:b/>
+          <w:color w:val="1B365D"/>
+        </w:rPr>
+        <w:t xml:space="preserve">Table Management (ADD-ONS): </w:t>
+      </w:r>
+      <w:r>
+        <w:t>A live interactive map of the dining floor showing table status (occupied, vacant, billed, cleaning) to optimize guest seating.</w:t>
+      </w:r>
+    </w:p>
+    <w:p>
+      <w:pPr>
+        <w:pStyle w:val="ListBullet"/>
+        <w:spacing w:after="60"/>
+      </w:pPr>
+      <w:r>
+        <w:rPr>
+          <w:b/>
+          <w:color w:val="1B365D"/>
+        </w:rPr>
+        <w:t xml:space="preserve">Scan &amp; QR Order (ADD-ONS): </w:t>
+      </w:r>
+      <w:r>
+        <w:t>Allows customers to scan a dining-table QR code, view the menu, and place orders directly from their personal smartphones.</w:t>
+      </w:r>
+    </w:p>
+    <w:p>
+      <w:pPr>
+        <w:pStyle w:val="ListBullet"/>
+        <w:spacing w:after="60"/>
+      </w:pPr>
+      <w:r>
+        <w:rPr>
+          <w:b/>
+          <w:color w:val="1B365D"/>
+        </w:rPr>
+        <w:t xml:space="preserve">QR-based Feedback (ADD-ONS): </w:t>
+      </w:r>
+      <w:r>
+        <w:t>Appends feedback QR codes on bills so customers can rate their dining experience online, feeding data into the CRM.</w:t>
+      </w:r>
+    </w:p>
+    <w:p>
+      <w:pPr>
+        <w:pStyle w:val="ListBullet"/>
+        <w:spacing w:after="60"/>
+      </w:pPr>
+      <w:r>
+        <w:rPr>
+          <w:b/>
+          <w:color w:val="1B365D"/>
+        </w:rPr>
+        <w:lastRenderedPageBreak/>
+        <w:t xml:space="preserve">Waiter Calling System (ADD-ONS): </w:t>
+      </w:r>
+      <w:r>
+        <w:t>A digital tableside alert system allowing customers to call a server or request their bill with a single button press.</w:t>
+      </w:r>
+    </w:p>
+    <w:p>
+      <w:pPr>
+        <w:pStyle w:val="ListBullet"/>
+        <w:spacing w:after="60"/>
+      </w:pPr>
+      <w:r>
+        <w:rPr>
+          <w:b/>
+          <w:color w:val="1B365D"/>
+        </w:rPr>
+        <w:t xml:space="preserve">Dynamic Reports (ADD-ONS): </w:t>
+      </w:r>
+      <w:r>
+        <w:t>Generates custom reports detailing payment method distributions, discount audits, and taxation compliance summaries.</w:t>
+      </w:r>
+    </w:p>
+    <w:p>
+      <w:pPr>
+        <w:pStyle w:val="ListBullet"/>
+        <w:spacing w:after="60"/>
+      </w:pPr>
+      <w:r>
+        <w:rPr>
+          <w:b/>
+          <w:color w:val="1B365D"/>
+        </w:rPr>
+        <w:t xml:space="preserve">WhatsApp Invoice (ADD-ONS): </w:t>
+      </w:r>
+      <w:r>
+        <w:t>Saves paper by sending official, digital invoices directly to the customer's WhatsApp number immediately upon settlement.</w:t>
+      </w:r>
+    </w:p>
+    <w:p>
+      <w:pPr>
+        <w:pStyle w:val="ListBullet"/>
+        <w:spacing w:after="60"/>
+      </w:pPr>
+      <w:r>
+        <w:rPr>
+          <w:b/>
+          <w:color w:val="1B365D"/>
+        </w:rPr>
+        <w:t xml:space="preserve">Restaurant Website (ADD-ONS): </w:t>
+      </w:r>
+      <w:r>
+        <w:t>An SEO-friendly promotional website containing the restaurant's location, story, digital menu, and direct online ordering links.</w:t>
+      </w:r>
+    </w:p>
+    <w:p>
+      <w:pPr>
+        <w:pStyle w:val="ListBullet"/>
+        <w:spacing w:after="60"/>
+      </w:pPr>
+      <w:r>
+        <w:rPr>
+          <w:b/>
+          <w:color w:val="1B365D"/>
+        </w:rPr>
+        <w:t xml:space="preserve">Customer Profiles (LOYALTY &amp; CRM ENGINE): </w:t>
+      </w:r>
+      <w:r>
+        <w:t>Builds rich customer portfolios including transaction histories, milestone dates, and lifetime values.</w:t>
+      </w:r>
+    </w:p>
+    <w:p>
+      <w:pPr>
+        <w:pStyle w:val="ListBullet"/>
+        <w:spacing w:after="60"/>
+      </w:pPr>
+      <w:r>
+        <w:rPr>
+          <w:b/>
+          <w:color w:val="1B365D"/>
+        </w:rPr>
+        <w:t xml:space="preserve">Points Earn/Redeem at POS (LOYALTY &amp; CRM ENGINE): </w:t>
+      </w:r>
+      <w:r>
+        <w:t>An automated reward points engine that accumulates loyalty credits at checkout and allows easy redemption on future visits.</w:t>
+      </w:r>
+    </w:p>
+    <w:p>
+      <w:pPr>
+        <w:pStyle w:val="ListBullet"/>
+        <w:spacing w:after="60"/>
+      </w:pPr>
+      <w:r>
+        <w:rPr>
+          <w:b/>
+          <w:color w:val="1B365D"/>
+        </w:rPr>
+        <w:t xml:space="preserve">Automated Retention Campaigns (LOYALTY &amp; CRM ENGINE): </w:t>
+      </w:r>
+      <w:r>
+        <w:t>Trigger-based SMS or email notifications sent to inactive customers to invite them back with custom discount vouchers.</w:t>
+      </w:r>
+    </w:p>
+    <w:p>
+      <w:pPr>
+        <w:pStyle w:val="ListBullet"/>
+        <w:spacing w:after="60"/>
+      </w:pPr>
+      <w:r>
+        <w:rPr>
+          <w:b/>
+          <w:color w:val="1B365D"/>
+        </w:rPr>
+        <w:t xml:space="preserve">Gamified Loyalty — Food Quests (LOYALTY &amp; CRM ENGINE): </w:t>
+      </w:r>
+      <w:r>
+        <w:t>Creates fun challenges (e.g. 'try 5 different dishes to unlock a discount') to boost repeat visits and customer engagement.</w:t>
+      </w:r>
+    </w:p>
+    <w:p>
+      <w:pPr>
+        <w:pStyle w:val="ListBullet"/>
+        <w:spacing w:after="60"/>
+      </w:pPr>
+      <w:r>
+        <w:rPr>
+          <w:b/>
+          <w:color w:val="1B365D"/>
+        </w:rPr>
+        <w:t xml:space="preserve">24/7 Support (SUPPORT): </w:t>
+      </w:r>
+      <w:r>
+        <w:t>Access to round-the-clock technical support for server issues, billing discrepancies, or hardware troubleshooting.</w:t>
+      </w:r>
+    </w:p>
+    <w:p>
+      <w:pPr>
+        <w:pStyle w:val="ListBullet"/>
+        <w:spacing w:after="60"/>
+      </w:pPr>
+      <w:r>
+        <w:rPr>
+          <w:b/>
+          <w:color w:val="1B365D"/>
+        </w:rPr>
+        <w:t xml:space="preserve">Free Training (SUPPORT): </w:t>
+      </w:r>
+      <w:r>
+        <w:t>Initial comprehensive onboarding classes to train managers and system administrators.</w:t>
+      </w:r>
+    </w:p>
+    <w:p>
+      <w:pPr>
+        <w:pStyle w:val="ListBullet"/>
+        <w:spacing w:after="60"/>
+      </w:pPr>
+      <w:r>
+        <w:rPr>
+          <w:b/>
+          <w:color w:val="1B365D"/>
+        </w:rPr>
+        <w:t xml:space="preserve">Free Staff Re-training (SUPPORT): </w:t>
+      </w:r>
+      <w:r>
+        <w:t>Regular refresher training sessions for new restaurant workers at no additional charge.</w:t>
+      </w:r>
+    </w:p>
+    <w:p>
+      <w:pPr>
+        <w:spacing w:after="120"/>
+      </w:pPr>
+    </w:p>
+    <w:p>
+      <w:pPr>
+        <w:pStyle w:val="Heading2"/>
+      </w:pPr>
+      <w:r>
+        <w:rPr>
+          <w:color w:val="1B365D"/>
+        </w:rPr>
+        <w:t>Excluded Features (Upgrade Required):</w:t>
+      </w:r>
+    </w:p>
+    <w:p>
+      <w:pPr>
+        <w:pStyle w:val="ListBullet"/>
+        <w:spacing w:after="60"/>
+      </w:pPr>
+      <w:r>
+        <w:rPr>
+          <w:b/>
+          <w:color w:val="808080"/>
+        </w:rPr>
+        <w:t xml:space="preserve">QSR Panel: </w:t>
+      </w:r>
+      <w:r>
+        <w:t>Not included. Requires subscription upgrade.</w:t>
+      </w:r>
+    </w:p>
+    <w:p>
+      <w:pPr>
+        <w:pStyle w:val="ListBullet"/>
+        <w:spacing w:after="60"/>
+      </w:pPr>
+      <w:r>
+        <w:rPr>
+          <w:b/>
+          <w:color w:val="808080"/>
+        </w:rPr>
+        <w:t xml:space="preserve">Token Management: </w:t>
+      </w:r>
+      <w:r>
+        <w:t>Not included. Requires subscription upgrade.</w:t>
+      </w:r>
+    </w:p>
+    <w:p>
+      <w:pPr>
+        <w:pStyle w:val="ListBullet"/>
+        <w:spacing w:after="60"/>
+      </w:pPr>
+      <w:r>
+        <w:rPr>
+          <w:b/>
+          <w:color w:val="808080"/>
+        </w:rPr>
+        <w:t xml:space="preserve">TheBoxSync Payroll: </w:t>
+      </w:r>
+      <w:r>
+        <w:t>Not included. Requires subscription upgrade.</w:t>
+      </w:r>
+    </w:p>
+    <w:p>
+      <w:pPr>
+        <w:pStyle w:val="ListBullet"/>
+        <w:spacing w:after="60"/>
+      </w:pPr>
+      <w:r>
+        <w:rPr>
+          <w:b/>
+          <w:color w:val="808080"/>
+        </w:rPr>
+        <w:t xml:space="preserve">Dedicated Account Manager: </w:t>
+      </w:r>
+      <w:r>
+        <w:t>Not included. Requires subscription upgrade.</w:t>
+      </w:r>
+    </w:p>
+    <w:p>
+      <w:pPr>
+        <w:spacing w:after="160"/>
+      </w:pPr>
+    </w:p>
+    <w:p>
+      <w:pPr>
+        <w:pStyle w:val="Heading2"/>
+      </w:pPr>
+      <w:r>
+        <w:rPr>
+          <w:color w:val="1B365D"/>
+        </w:rPr>
+        <w:t>Panel Interfaces Deployed &amp; Verified under the FINE            DINE Plan:</w:t>
+      </w:r>
+    </w:p>
+    <w:p>
+      <w:r>
+        <w:br w:type="page"/>
+      </w:r>
+    </w:p>
+    <w:p>
+      <w:pPr>
+        <w:pStyle w:val="Heading1"/>
+      </w:pPr>
       <w:r>
         <w:rPr>
           <w:color w:val="1B365D"/>
           <w:sz w:val="36"/>
         </w:rPr>
-        <w:t xml:space="preserve"> </w:t>
-      </w:r>
-      <w:r>
-        <w:rPr>
-          <w:color w:val="1B365D"/>
-          <w:sz w:val="36"/>
-        </w:rPr>
-        <w:t>DINE Plan</w:t>
-      </w:r>
-    </w:p>
-    <w:p>
-      <w:pPr>
-        <w:spacing w:after="240"/>
-      </w:pPr>
-      <w:r>
-        <w:rPr>
-          <w:b/>
-        </w:rPr>
-        <w:t xml:space="preserve">Plan Price (Promo): </w:t>
-      </w:r>
-      <w:r>
-        <w:rPr>
-          <w:b/>
-          <w:color w:val="2E7559"/>
-        </w:rPr>
-        <w:t>₹16,000 / month</w:t>
-      </w:r>
-      <w:r>
-        <w:rPr>
-          <w:color w:val="B4B4B4"/>
-        </w:rPr>
-        <w:t xml:space="preserve">  |  </w:t>
-      </w:r>
-      <w:r>
-        <w:rPr>
-          <w:b/>
-        </w:rPr>
-        <w:t xml:space="preserve">Actual Price: </w:t>
-      </w:r>
-      <w:r>
-        <w:rPr>
-          <w:i/>
-        </w:rPr>
-        <w:t>₹20,000 / month (Strikethrough in catalog)</w:t>
-      </w:r>
-    </w:p>
-    <w:p>
-      <w:pPr>
-        <w:pStyle w:val="Heading2"/>
-      </w:pPr>
-      <w:r>
-        <w:rPr>
-          <w:color w:val="1B365D"/>
-        </w:rPr>
-        <w:t>Included Features &amp; Functional Points Explained:</w:t>
-      </w:r>
-    </w:p>
-    <w:p>
-      <w:pPr>
-        <w:pStyle w:val="ListBullet"/>
-        <w:spacing w:after="60"/>
-      </w:pPr>
-      <w:r>
-        <w:rPr>
-          <w:b/>
-          <w:color w:val="1B365D"/>
-        </w:rPr>
-        <w:t xml:space="preserve">Inventory Management (BILLING &amp; CORE): </w:t>
-      </w:r>
-      <w:r>
-        <w:t>Tracks raw material stock, recipe ingredients, purchase orders, and supplier bills in real-time, helping reduce food waste and optimize costs.</w:t>
-      </w:r>
-    </w:p>
-    <w:p>
-      <w:pPr>
-        <w:pStyle w:val="ListBullet"/>
-        <w:spacing w:after="60"/>
-      </w:pPr>
-      <w:r>
-        <w:rPr>
-          <w:b/>
-          <w:color w:val="1B365D"/>
-        </w:rPr>
-        <w:t xml:space="preserve">Statistics Management (BILLING &amp; CORE): </w:t>
-      </w:r>
-      <w:r>
-        <w:t>Provides analytical dashboards showing top-performing dishes, sales volumes, hourly peaks, and revenue margins to support data-driven decisions.</w:t>
-      </w:r>
-    </w:p>
-    <w:p>
-      <w:pPr>
-        <w:pStyle w:val="ListBullet"/>
-        <w:spacing w:after="60"/>
-      </w:pPr>
-      <w:r>
-        <w:rPr>
-          <w:b/>
-          <w:color w:val="1B365D"/>
-        </w:rPr>
-        <w:t xml:space="preserve">Third-party Integrations (BILLING &amp; CORE): </w:t>
-      </w:r>
-      <w:r>
-        <w:t>Seamlessly syncs orders from food delivery platforms (such as Swiggy and Zomato) directly into the POS system, avoiding manual double-entry.</w:t>
-      </w:r>
-    </w:p>
-    <w:p>
-      <w:pPr>
-        <w:pStyle w:val="ListBullet"/>
-        <w:spacing w:after="60"/>
-      </w:pPr>
-      <w:r>
-        <w:rPr>
-          <w:b/>
-          <w:color w:val="1B365D"/>
-        </w:rPr>
-        <w:t xml:space="preserve">In-built CRM (BILLING &amp; CORE): </w:t>
-      </w:r>
-      <w:r>
-        <w:t>Saves guest order history, contact details, and dietary preferences to deliver a personalized dining experience.</w:t>
-      </w:r>
-    </w:p>
-    <w:p>
-      <w:pPr>
-        <w:pStyle w:val="ListBullet"/>
-        <w:spacing w:after="60"/>
-      </w:pPr>
-      <w:r>
-        <w:rPr>
-          <w:b/>
-          <w:color w:val="1B365D"/>
-        </w:rPr>
-        <w:t xml:space="preserve">Menu Management (BILLING &amp; CORE): </w:t>
-      </w:r>
-      <w:r>
-        <w:t>Allows instant updates to categories, pricing, item availability, and modifiers across all POS registers and online menus.</w:t>
-      </w:r>
-    </w:p>
-    <w:p>
-      <w:pPr>
-        <w:pStyle w:val="ListBullet"/>
-        <w:spacing w:after="60"/>
-      </w:pPr>
-      <w:r>
-        <w:rPr>
-          <w:b/>
-          <w:color w:val="1B365D"/>
-        </w:rPr>
-        <w:t xml:space="preserve">Staff Management (BILLING &amp; CORE): </w:t>
-      </w:r>
-      <w:r>
-        <w:t>Tracks employee attendance, shift schedules, check-in/out stamps, and sets granular user roles and system access permissions.</w:t>
-      </w:r>
-    </w:p>
-    <w:p>
-      <w:pPr>
-        <w:pStyle w:val="ListBullet"/>
-        <w:spacing w:after="60"/>
-      </w:pPr>
-      <w:r>
-        <w:rPr>
-          <w:b/>
-          <w:color w:val="1B365D"/>
-        </w:rPr>
-        <w:t xml:space="preserve">Unlimited Users &amp; Terminals (BILLING &amp; CORE): </w:t>
-      </w:r>
-      <w:r>
-        <w:t>Enables the software to run on multiple devices (mobiles, tablets, PCs) without charging extra licensing fees per device/user.</w:t>
-      </w:r>
-    </w:p>
-    <w:p>
-      <w:pPr>
-        <w:pStyle w:val="ListBullet"/>
-        <w:spacing w:after="60"/>
-      </w:pPr>
-      <w:r>
-        <w:rPr>
-          <w:b/>
-          <w:color w:val="1B365D"/>
-        </w:rPr>
-        <w:t xml:space="preserve">Unlimited Cash Register (BILLING &amp; CORE): </w:t>
-      </w:r>
-      <w:r>
-        <w:t>Allows the creation of multiple digital tills to manage separate cashier drawers, making shift handovers and reconciliations easy.</w:t>
-      </w:r>
-    </w:p>
-    <w:p>
-      <w:pPr>
-        <w:pStyle w:val="ListBullet"/>
-        <w:spacing w:after="60"/>
-      </w:pPr>
-      <w:r>
-        <w:rPr>
-          <w:b/>
-          <w:color w:val="1B365D"/>
-        </w:rPr>
-        <w:t xml:space="preserve">Multi-terminal Billing (BILLING &amp; CORE): </w:t>
-      </w:r>
-      <w:r>
-        <w:t>Supports simultaneous order entering and payment processing on different registers, minimizing queue times during rush hours.</w:t>
-      </w:r>
-    </w:p>
-    <w:p>
-      <w:pPr>
-        <w:pStyle w:val="ListBullet"/>
-        <w:spacing w:after="60"/>
-      </w:pPr>
-      <w:r>
-        <w:rPr>
-          <w:b/>
-          <w:color w:val="1B365D"/>
-        </w:rPr>
-        <w:t xml:space="preserve">Manager Panel (ADD-ONS): </w:t>
-      </w:r>
-      <w:r>
-        <w:t>A back-office control panel that managers use to view real-time sales, adjust system settings, manage configurations, and edit staff rosters.</w:t>
-      </w:r>
-    </w:p>
-    <w:p>
-      <w:pPr>
-        <w:pStyle w:val="ListBullet"/>
-        <w:spacing w:after="60"/>
-      </w:pPr>
-      <w:r>
-        <w:rPr>
-          <w:b/>
-          <w:color w:val="1B365D"/>
-        </w:rPr>
-        <w:t xml:space="preserve">Create Cashier (ADD-ONS): </w:t>
-      </w:r>
-      <w:r>
-        <w:t>Gives the ability to onboard cashiers, trace active till sessions, and audit open/closed register balances.</w:t>
-      </w:r>
-    </w:p>
-    <w:p>
-      <w:pPr>
-        <w:pStyle w:val="ListBullet"/>
-        <w:spacing w:after="60"/>
-      </w:pPr>
-      <w:r>
-        <w:rPr>
-          <w:b/>
-          <w:color w:val="1B365D"/>
-        </w:rPr>
-        <w:t xml:space="preserve">Captain Panel (ADD-ONS): </w:t>
-      </w:r>
-      <w:r>
-        <w:t>A tableside ordering interface designed for waiters to enter customer selections, customize order notes, and send KOTs instantly to the kitchen.</w:t>
-      </w:r>
-    </w:p>
-    <w:p>
-      <w:pPr>
-        <w:pStyle w:val="ListBullet"/>
-        <w:spacing w:after="60"/>
-      </w:pPr>
-      <w:r>
-        <w:rPr>
-          <w:b/>
-          <w:color w:val="1B365D"/>
-        </w:rPr>
-        <w:t xml:space="preserve">Kitchen Display System (ADD-ONS): </w:t>
-      </w:r>
-      <w:r>
-        <w:t>A digital screen in the kitchen that organizes active orders chronologically, replacing paper slips and tracking preparation times.</w:t>
-      </w:r>
-    </w:p>
-    <w:p>
-      <w:pPr>
-        <w:pStyle w:val="ListBullet"/>
-        <w:spacing w:after="60"/>
-      </w:pPr>
-      <w:r>
-        <w:rPr>
-          <w:b/>
-          <w:color w:val="1B365D"/>
-        </w:rPr>
-        <w:t xml:space="preserve">Reservation Management (ADD-ONS): </w:t>
-      </w:r>
-      <w:r>
-        <w:t>An advanced tool to book guest tables, schedule dining slots, and manage waiting lists during busy periods.</w:t>
-      </w:r>
-    </w:p>
-    <w:p>
-      <w:pPr>
-        <w:pStyle w:val="ListBullet"/>
-        <w:spacing w:after="60"/>
-      </w:pPr>
-      <w:r>
-        <w:rPr>
-          <w:b/>
-          <w:color w:val="1B365D"/>
-        </w:rPr>
-        <w:t xml:space="preserve">Table Management (ADD-ONS): </w:t>
-      </w:r>
-      <w:r>
-        <w:t>A live interactive map of the dining floor showing table status (occupied, vacant, billed, cleaning) to optimize guest seating.</w:t>
-      </w:r>
-    </w:p>
-    <w:p>
-      <w:pPr>
-        <w:pStyle w:val="ListBullet"/>
-        <w:spacing w:after="60"/>
-      </w:pPr>
-      <w:r>
-        <w:rPr>
-          <w:b/>
-          <w:color w:val="1B365D"/>
-        </w:rPr>
-        <w:t xml:space="preserve">Scan &amp; QR Order (ADD-ONS): </w:t>
-      </w:r>
-      <w:r>
-        <w:t>Allows customers to scan a dining-table QR code, view the menu, and place orders directly from their personal smartphones.</w:t>
-      </w:r>
-    </w:p>
-    <w:p>
-      <w:pPr>
-        <w:pStyle w:val="ListBullet"/>
-        <w:spacing w:after="60"/>
-      </w:pPr>
-      <w:r>
-        <w:rPr>
-          <w:b/>
-          <w:color w:val="1B365D"/>
-        </w:rPr>
-        <w:t xml:space="preserve">QR-based Feedback (ADD-ONS): </w:t>
-      </w:r>
-      <w:r>
-        <w:t>Appends feedback QR codes on bills so customers can rate their dining experience online, feeding data into the CRM.</w:t>
-      </w:r>
-    </w:p>
-    <w:p>
-      <w:pPr>
-        <w:pStyle w:val="ListBullet"/>
-        <w:spacing w:after="60"/>
-      </w:pPr>
-      <w:r>
-        <w:rPr>
-          <w:b/>
-          <w:color w:val="1B365D"/>
-        </w:rPr>
-        <w:lastRenderedPageBreak/>
-        <w:t xml:space="preserve">Waiter Calling System (ADD-ONS): </w:t>
-      </w:r>
-      <w:r>
-        <w:t>A digital tableside alert system allowing customers to call a server or request their bill with a single button press.</w:t>
-      </w:r>
-    </w:p>
-    <w:p>
-      <w:pPr>
-        <w:pStyle w:val="ListBullet"/>
-        <w:spacing w:after="60"/>
-      </w:pPr>
-      <w:r>
-        <w:rPr>
-          <w:b/>
-          <w:color w:val="1B365D"/>
-        </w:rPr>
-        <w:t xml:space="preserve">Dynamic Reports (ADD-ONS): </w:t>
-      </w:r>
-      <w:r>
-        <w:t>Generates custom reports detailing payment method distributions, discount audits, and taxation compliance summaries.</w:t>
-      </w:r>
-    </w:p>
-    <w:p>
-      <w:pPr>
-        <w:pStyle w:val="ListBullet"/>
-        <w:spacing w:after="60"/>
-      </w:pPr>
-      <w:r>
-        <w:rPr>
-          <w:b/>
-          <w:color w:val="1B365D"/>
-        </w:rPr>
-        <w:t xml:space="preserve">WhatsApp Invoice (ADD-ONS): </w:t>
-      </w:r>
-      <w:r>
-        <w:t>Saves paper by sending official, digital invoices directly to the customer's WhatsApp number immediately upon settlement.</w:t>
-      </w:r>
-    </w:p>
-    <w:p>
-      <w:pPr>
-        <w:pStyle w:val="ListBullet"/>
-        <w:spacing w:after="60"/>
-      </w:pPr>
-      <w:r>
-        <w:rPr>
-          <w:b/>
-          <w:color w:val="1B365D"/>
-        </w:rPr>
-        <w:t xml:space="preserve">Restaurant Website (ADD-ONS): </w:t>
-      </w:r>
-      <w:r>
-        <w:t>An SEO-friendly promotional website containing the restaurant's location, story, digital menu, and direct online ordering links.</w:t>
-      </w:r>
-    </w:p>
-    <w:p>
-      <w:pPr>
-        <w:pStyle w:val="ListBullet"/>
-        <w:spacing w:after="60"/>
-      </w:pPr>
-      <w:r>
-        <w:rPr>
-          <w:b/>
-          <w:color w:val="1B365D"/>
-        </w:rPr>
-        <w:t xml:space="preserve">Customer Profiles (LOYALTY &amp; CRM ENGINE): </w:t>
-      </w:r>
-      <w:r>
-        <w:t>Builds rich customer portfolios including transaction histories, milestone dates, and lifetime values.</w:t>
-      </w:r>
-    </w:p>
-    <w:p>
-      <w:pPr>
-        <w:pStyle w:val="ListBullet"/>
-        <w:spacing w:after="60"/>
-      </w:pPr>
-      <w:r>
-        <w:rPr>
-          <w:b/>
-          <w:color w:val="1B365D"/>
-        </w:rPr>
-        <w:t xml:space="preserve">Points Earn/Redeem at POS (LOYALTY &amp; CRM ENGINE): </w:t>
-      </w:r>
-      <w:r>
-        <w:t>An automated reward points engine that accumulates loyalty credits at checkout and allows easy redemption on future visits.</w:t>
-      </w:r>
-    </w:p>
-    <w:p>
-      <w:pPr>
-        <w:pStyle w:val="ListBullet"/>
-        <w:spacing w:after="60"/>
-      </w:pPr>
-      <w:r>
-        <w:rPr>
-          <w:b/>
-          <w:color w:val="1B365D"/>
-        </w:rPr>
-        <w:t xml:space="preserve">Automated Retention Campaigns (LOYALTY &amp; CRM ENGINE): </w:t>
-      </w:r>
-      <w:r>
-        <w:t>Trigger-based SMS or email notifications sent to inactive customers to invite them back with custom discount vouchers.</w:t>
-      </w:r>
-    </w:p>
-    <w:p>
-      <w:pPr>
-        <w:pStyle w:val="ListBullet"/>
-        <w:spacing w:after="60"/>
-      </w:pPr>
-      <w:r>
-        <w:rPr>
-          <w:b/>
-          <w:color w:val="1B365D"/>
-        </w:rPr>
-        <w:t xml:space="preserve">Gamified Loyalty — Food Quests (LOYALTY &amp; CRM ENGINE): </w:t>
-      </w:r>
-      <w:r>
-        <w:t>Creates fun challenges (e.g. 'try 5 different dishes to unlock a discount') to boost repeat visits and customer engagement.</w:t>
-      </w:r>
-    </w:p>
-    <w:p>
-      <w:pPr>
-        <w:pStyle w:val="ListBullet"/>
-        <w:spacing w:after="60"/>
-      </w:pPr>
-      <w:r>
-        <w:rPr>
-          <w:b/>
-          <w:color w:val="1B365D"/>
-        </w:rPr>
-        <w:t xml:space="preserve">24/7 Support (SUPPORT): </w:t>
-      </w:r>
-      <w:r>
-        <w:t>Access to round-the-clock technical support for server issues, billing discrepancies, or hardware troubleshooting.</w:t>
-      </w:r>
-    </w:p>
-    <w:p>
-      <w:pPr>
-        <w:pStyle w:val="ListBullet"/>
-        <w:spacing w:after="60"/>
-      </w:pPr>
-      <w:r>
-        <w:rPr>
-          <w:b/>
-          <w:color w:val="1B365D"/>
-        </w:rPr>
-        <w:t xml:space="preserve">Free Training (SUPPORT): </w:t>
-      </w:r>
-      <w:r>
-        <w:t>Initial comprehensive onboarding classes to train managers and system administrators.</w:t>
-      </w:r>
-    </w:p>
-    <w:p>
-      <w:pPr>
-        <w:pStyle w:val="ListBullet"/>
-        <w:spacing w:after="60"/>
-      </w:pPr>
-      <w:r>
-        <w:rPr>
-          <w:b/>
-          <w:color w:val="1B365D"/>
-        </w:rPr>
-        <w:t xml:space="preserve">Free Staff Re-training (SUPPORT): </w:t>
-      </w:r>
-      <w:r>
-        <w:t>Regular refresher training sessions for new restaurant workers at no additional charge.</w:t>
-      </w:r>
-    </w:p>
-    <w:p>
-      <w:pPr>
-        <w:spacing w:after="120"/>
-      </w:pPr>
-    </w:p>
-    <w:p>
-      <w:pPr>
-        <w:pStyle w:val="Heading2"/>
-      </w:pPr>
-      <w:r>
-        <w:rPr>
-          <w:color w:val="1B365D"/>
-        </w:rPr>
-        <w:t>Excluded Features (Upgrade Required):</w:t>
-      </w:r>
-    </w:p>
-    <w:p>
-      <w:pPr>
-        <w:pStyle w:val="ListBullet"/>
-        <w:spacing w:after="60"/>
-      </w:pPr>
-      <w:r>
-        <w:rPr>
-          <w:b/>
-          <w:color w:val="808080"/>
-        </w:rPr>
-        <w:t xml:space="preserve">QSR Panel: </w:t>
-      </w:r>
-      <w:r>
-        <w:t>Not included. Requires subscription upgrade.</w:t>
-      </w:r>
-    </w:p>
-    <w:p>
-      <w:pPr>
-        <w:pStyle w:val="ListBullet"/>
-        <w:spacing w:after="60"/>
-      </w:pPr>
-      <w:r>
-        <w:rPr>
-          <w:b/>
-          <w:color w:val="808080"/>
-        </w:rPr>
-        <w:t xml:space="preserve">Token Management: </w:t>
-      </w:r>
-      <w:r>
-        <w:t>Not included. Requires subscription upgrade.</w:t>
-      </w:r>
-    </w:p>
-    <w:p>
-      <w:pPr>
-        <w:pStyle w:val="ListBullet"/>
-        <w:spacing w:after="60"/>
-      </w:pPr>
-      <w:r>
-        <w:rPr>
-          <w:b/>
-          <w:color w:val="808080"/>
-        </w:rPr>
-        <w:t xml:space="preserve">TheBoxSync Payroll: </w:t>
-      </w:r>
-      <w:r>
-        <w:t>Not included. Requires subscription upgrade.</w:t>
-      </w:r>
-    </w:p>
-    <w:p>
-      <w:pPr>
-        <w:pStyle w:val="ListBullet"/>
-        <w:spacing w:after="60"/>
-      </w:pPr>
-      <w:r>
-        <w:rPr>
-          <w:b/>
-          <w:color w:val="808080"/>
-        </w:rPr>
-        <w:t xml:space="preserve">Dedicated Account Manager: </w:t>
-      </w:r>
-      <w:r>
-        <w:t>Not included. Requires subscription upgrade.</w:t>
-      </w:r>
-    </w:p>
-    <w:p>
-      <w:pPr>
-        <w:spacing w:after="160"/>
-      </w:pPr>
-    </w:p>
-    <w:p>
-      <w:pPr>
-        <w:pStyle w:val="Heading2"/>
-      </w:pPr>
-      <w:r>
-        <w:rPr>
-          <w:color w:val="1B365D"/>
-        </w:rPr>
-        <w:t>Panel Interfaces Deployed &amp; Verified under the FINE            DINE Plan:</w:t>
-      </w:r>
-    </w:p>
-    <w:p>
-      <w:r>
-        <w:br w:type="page"/>
-      </w:r>
-    </w:p>
-    <w:p>
-      <w:pPr>
-        <w:pStyle w:val="Heading1"/>
-      </w:pPr>
-      <w:r>
-        <w:rPr>
-          <w:color w:val="1B365D"/>
-          <w:sz w:val="36"/>
-        </w:rPr>
         <w:lastRenderedPageBreak/>
         <w:t>Plan 4: CLOUD Plan</w:t>
       </w:r>
@@ -2856,13 +2889,28 @@
           <w:b/>
           <w:color w:val="2E7559"/>
         </w:rPr>
-        <w:t>₹10,000 / month</w:t>
+        <w:t xml:space="preserve">₹10,000 / </w:t>
+      </w:r>
+      <w:proofErr w:type="gramStart"/>
+      <w:r>
+        <w:rPr>
+          <w:b/>
+          <w:color w:val="2E7559"/>
+        </w:rPr>
+        <w:t>month</w:t>
       </w:r>
       <w:r>
         <w:rPr>
           <w:color w:val="B4B4B4"/>
         </w:rPr>
-        <w:t xml:space="preserve">  |  </w:t>
+        <w:t xml:space="preserve">  |</w:t>
+      </w:r>
+      <w:proofErr w:type="gramEnd"/>
+      <w:r>
+        <w:rPr>
+          <w:color w:val="B4B4B4"/>
+        </w:rPr>
+        <w:t xml:space="preserve">  </w:t>
       </w:r>
       <w:r>
         <w:rPr>
@@ -3625,13 +3673,28 @@
           <w:b/>
           <w:color w:val="2E7559"/>
         </w:rPr>
-        <w:t>₹24,000 / month</w:t>
+        <w:t xml:space="preserve">₹24,000 / </w:t>
+      </w:r>
+      <w:proofErr w:type="gramStart"/>
+      <w:r>
+        <w:rPr>
+          <w:b/>
+          <w:color w:val="2E7559"/>
+        </w:rPr>
+        <w:t>month</w:t>
       </w:r>
       <w:r>
         <w:rPr>
           <w:color w:val="B4B4B4"/>
         </w:rPr>
-        <w:t xml:space="preserve">  |  </w:t>
+        <w:t xml:space="preserve">  |</w:t>
+      </w:r>
+      <w:proofErr w:type="gramEnd"/>
+      <w:r>
+        <w:rPr>
+          <w:color w:val="B4B4B4"/>
+        </w:rPr>
+        <w:t xml:space="preserve">  </w:t>
       </w:r>
       <w:r>
         <w:rPr>

</xml_diff>